<commit_message>
feat(ranh-gioi): cong cu ve ranh gioi khu pho tren ban do + luu DB, bo hardcode KP25_POLYGON
</commit_message>
<xml_diff>
--- a/docs/Huong-dan-da-khu-pho.docx
+++ b/docs/Huong-dan-da-khu-pho.docx
@@ -765,7 +765,7 @@
                 <w:sz w:val="21"/>
                 <w:szCs w:val="21"/>
               </w:rPr>
-              <w:t xml:space="preserve">Portal lọc dữ liệu theo khu phố của deployment</w:t>
+              <w:t xml:space="preserve">Ranh giới khu phố — vẽ trên bản đồ, lưu vào CSDL</w:t>
             </w:r>
           </w:p>
         </w:tc>
@@ -808,7 +808,7 @@
                 <w:sz w:val="21"/>
                 <w:szCs w:val="21"/>
               </w:rPr>
-              <w:t xml:space="preserve">Gán don_vi_id khi tạo hộ/nhân khẩu trong admin</w:t>
+              <w:t xml:space="preserve">Portal lọc dữ liệu theo khu phố của deployment</w:t>
             </w:r>
           </w:p>
         </w:tc>
@@ -851,7 +851,7 @@
                 <w:sz w:val="21"/>
                 <w:szCs w:val="21"/>
               </w:rPr>
-              <w:t xml:space="preserve">Lọc số liệu TỔNG ở Dashboard/Báo cáo/Tìm kiếm admin</w:t>
+              <w:t xml:space="preserve">Gán don_vi_id khi tạo hộ/nhân khẩu trong admin</w:t>
             </w:r>
           </w:p>
         </w:tc>
@@ -871,7 +871,7 @@
                 <w:sz w:val="21"/>
                 <w:szCs w:val="21"/>
               </w:rPr>
-              <w:t xml:space="preserve">Làm khi onboard KP thật</w:t>
+              <w:t xml:space="preserve">Đã triển khai</w:t>
             </w:r>
           </w:p>
         </w:tc>
@@ -894,7 +894,7 @@
                 <w:sz w:val="21"/>
                 <w:szCs w:val="21"/>
               </w:rPr>
-              <w:t xml:space="preserve">Nội dung tĩnh còn ghi "Khu phố 25" (hướng dẫn/thủ tục/liên hệ)</w:t>
+              <w:t xml:space="preserve">Lọc số liệu TỔNG ở Dashboard/Báo cáo/Tìm kiếm admin</w:t>
             </w:r>
           </w:p>
         </w:tc>
@@ -902,6 +902,48 @@
           <w:tcPr>
             <w:tcW w:type="dxa" w:w="2360"/>
             <w:shd w:fill="F1F5F9" w:val="clear"/>
+            <w:tcMar>
+              <w:top w:type="dxa" w:w="50"/>
+              <w:left w:type="dxa" w:w="90"/>
+              <w:bottom w:type="dxa" w:w="50"/>
+              <w:right w:type="dxa" w:w="90"/>
+            </w:tcMar>
+          </w:tcPr>
+          <w:p>
+            <w:r>
+              <w:rPr>
+                <w:sz w:val="21"/>
+                <w:szCs w:val="21"/>
+              </w:rPr>
+              <w:t xml:space="preserve">Làm khi onboard KP thật</w:t>
+            </w:r>
+          </w:p>
+        </w:tc>
+      </w:tr>
+      <w:tr>
+        <w:tc>
+          <w:tcPr>
+            <w:tcW w:type="dxa" w:w="7000"/>
+            <w:tcMar>
+              <w:top w:type="dxa" w:w="50"/>
+              <w:left w:type="dxa" w:w="90"/>
+              <w:bottom w:type="dxa" w:w="50"/>
+              <w:right w:type="dxa" w:w="90"/>
+            </w:tcMar>
+          </w:tcPr>
+          <w:p>
+            <w:r>
+              <w:rPr>
+                <w:sz w:val="21"/>
+                <w:szCs w:val="21"/>
+              </w:rPr>
+              <w:t xml:space="preserve">Nội dung tĩnh còn ghi "Khu phố 25" (hướng dẫn/thủ tục/liên hệ)</w:t>
+            </w:r>
+          </w:p>
+        </w:tc>
+        <w:tc>
+          <w:tcPr>
+            <w:tcW w:type="dxa" w:w="2360"/>
             <w:tcMar>
               <w:top w:type="dxa" w:w="50"/>
               <w:left w:type="dxa" w:w="90"/>
@@ -2214,6 +2256,196 @@
           <w:szCs w:val="22"/>
         </w:rPr>
         <w:t xml:space="preserve"> (UUID) và slug của khu phố.</w:t>
+      </w:r>
+    </w:p>
+    <w:p>
+      <w:pPr>
+        <w:pStyle w:val="Heading2"/>
+        <w:spacing w:after="100" w:before="240"/>
+      </w:pPr>
+      <w:r>
+        <w:rPr>
+          <w:b/>
+          <w:bCs/>
+          <w:color w:val="1E3A5F"/>
+          <w:sz w:val="25"/>
+          <w:szCs w:val="25"/>
+        </w:rPr>
+        <w:t xml:space="preserve">Bước 1b — Vẽ ranh giới khu phố</w:t>
+      </w:r>
+    </w:p>
+    <w:p>
+      <w:pPr>
+        <w:pStyle w:val="ListParagraph"/>
+        <w:numPr>
+          <w:ilvl w:val="0"/>
+          <w:numId w:val="2"/>
+        </w:numPr>
+        <w:spacing w:after="80" w:line="270"/>
+      </w:pPr>
+      <w:r>
+        <w:rPr>
+          <w:sz w:val="22"/>
+          <w:szCs w:val="22"/>
+        </w:rPr>
+        <w:t xml:space="preserve">Tại thẻ khu phố vừa tạo → nhấn </w:t>
+      </w:r>
+      <w:r>
+        <w:rPr>
+          <w:b/>
+          <w:bCs/>
+          <w:sz w:val="22"/>
+          <w:szCs w:val="22"/>
+        </w:rPr>
+        <w:t xml:space="preserve">Ranh giới</w:t>
+      </w:r>
+      <w:r>
+        <w:rPr>
+          <w:sz w:val="22"/>
+          <w:szCs w:val="22"/>
+        </w:rPr>
+        <w:t xml:space="preserve">.</w:t>
+      </w:r>
+    </w:p>
+    <w:p>
+      <w:pPr>
+        <w:pStyle w:val="ListParagraph"/>
+        <w:numPr>
+          <w:ilvl w:val="0"/>
+          <w:numId w:val="2"/>
+        </w:numPr>
+        <w:spacing w:after="80" w:line="270"/>
+      </w:pPr>
+      <w:r>
+        <w:rPr>
+          <w:b/>
+          <w:bCs/>
+          <w:sz w:val="22"/>
+          <w:szCs w:val="22"/>
+        </w:rPr>
+        <w:t xml:space="preserve">Bấm lên bản đồ</w:t>
+      </w:r>
+      <w:r>
+        <w:rPr>
+          <w:sz w:val="22"/>
+          <w:szCs w:val="22"/>
+        </w:rPr>
+        <w:t xml:space="preserve"> để thêm từng đỉnh · </w:t>
+      </w:r>
+      <w:r>
+        <w:rPr>
+          <w:b/>
+          <w:bCs/>
+          <w:sz w:val="22"/>
+          <w:szCs w:val="22"/>
+        </w:rPr>
+        <w:t xml:space="preserve">kéo đỉnh</w:t>
+      </w:r>
+      <w:r>
+        <w:rPr>
+          <w:sz w:val="22"/>
+          <w:szCs w:val="22"/>
+        </w:rPr>
+        <w:t xml:space="preserve"> để chỉnh · </w:t>
+      </w:r>
+      <w:r>
+        <w:rPr>
+          <w:b/>
+          <w:bCs/>
+          <w:sz w:val="22"/>
+          <w:szCs w:val="22"/>
+        </w:rPr>
+        <w:t xml:space="preserve">bấm vào đỉnh</w:t>
+      </w:r>
+      <w:r>
+        <w:rPr>
+          <w:sz w:val="22"/>
+          <w:szCs w:val="22"/>
+        </w:rPr>
+        <w:t xml:space="preserve"> để xoá. Cần ít nhất 3 đỉnh → nhấn </w:t>
+      </w:r>
+      <w:r>
+        <w:rPr>
+          <w:b/>
+          <w:bCs/>
+          <w:sz w:val="22"/>
+          <w:szCs w:val="22"/>
+        </w:rPr>
+        <w:t xml:space="preserve">Lưu ranh giới</w:t>
+      </w:r>
+      <w:r>
+        <w:rPr>
+          <w:sz w:val="22"/>
+          <w:szCs w:val="22"/>
+        </w:rPr>
+        <w:t xml:space="preserve">.</w:t>
+      </w:r>
+    </w:p>
+    <w:p>
+      <w:pPr>
+        <w:pStyle w:val="ListParagraph"/>
+        <w:numPr>
+          <w:ilvl w:val="0"/>
+          <w:numId w:val="2"/>
+        </w:numPr>
+        <w:spacing w:after="80" w:line="270"/>
+      </w:pPr>
+      <w:r>
+        <w:rPr>
+          <w:sz w:val="22"/>
+          <w:szCs w:val="22"/>
+        </w:rPr>
+        <w:t xml:space="preserve">Nếu đã có file ranh giới hành chính: dùng </w:t>
+      </w:r>
+      <w:r>
+        <w:rPr>
+          <w:b/>
+          <w:bCs/>
+          <w:sz w:val="22"/>
+          <w:szCs w:val="22"/>
+        </w:rPr>
+        <w:t xml:space="preserve">Nhập GeoJSON</w:t>
+      </w:r>
+      <w:r>
+        <w:rPr>
+          <w:sz w:val="22"/>
+          <w:szCs w:val="22"/>
+        </w:rPr>
+        <w:t xml:space="preserve"> (hệ thống tự đảo [kinh độ, vĩ độ] → [vĩ độ, kinh độ]).</w:t>
+      </w:r>
+    </w:p>
+    <w:p>
+      <w:pPr>
+        <w:pStyle w:val="ListParagraph"/>
+        <w:numPr>
+          <w:ilvl w:val="0"/>
+          <w:numId w:val="2"/>
+        </w:numPr>
+        <w:spacing w:after="80" w:line="270"/>
+      </w:pPr>
+      <w:r>
+        <w:rPr>
+          <w:sz w:val="22"/>
+          <w:szCs w:val="22"/>
+        </w:rPr>
+        <w:t xml:space="preserve">Ranh giới dùng chung cho bản đồ GIS của cán bộ và bản đồ công khai trên portal; đồng thời dùng để rải vị trí ước tính cho hộ chưa có toạ độ GPS.</w:t>
+      </w:r>
+    </w:p>
+    <w:p>
+      <w:pPr>
+        <w:pStyle w:val="ListParagraph"/>
+        <w:numPr>
+          <w:ilvl w:val="0"/>
+          <w:numId w:val="2"/>
+        </w:numPr>
+        <w:spacing w:after="80" w:line="270"/>
+      </w:pPr>
+      <w:r>
+        <w:rPr>
+          <w:sz w:val="22"/>
+          <w:szCs w:val="22"/>
+        </w:rPr>
+        <w:t xml:space="preserve">Chưa vẽ ranh giới → bản đồ không hiển thị ranh giới và không rải vị trí ước tính (tránh chấm sai chỗ).</w:t>
       </w:r>
     </w:p>
     <w:p>

</xml_diff>